<commit_message>
Add Band-It manufacturer and catalogue data to quotation
Co-Authored-By: Claude Sonnet 5.5 <noreply@anthropic.com>
Claude-Session: https://claude.ai/code/session_01JRLwg8YGR7MpuwpV6NU1A1
</commit_message>
<xml_diff>
--- a/FNT_NextGen_Quotation_DXCC1076308527EC.docx
+++ b/FNT_NextGen_Quotation_DXCC1076308527EC.docx
@@ -2476,22 +2476,7 @@
                 <w:i w:val="0"/>
                 <w:sz w:val="17"/>
               </w:rPr>
-            </w:r>
-            <w:r>
-              <w:rPr>
-                <w:b w:val="0"/>
-                <w:i w:val="0"/>
-                <w:sz w:val="17"/>
-                <w:highlight w:val="yellow"/>
-              </w:rPr>
-              <w:t>[ENTER OEM name - not in the information supplied]</w:t>
-            </w:r>
-            <w:r>
-              <w:rPr>
-                <w:b w:val="0"/>
-                <w:i w:val="0"/>
-                <w:sz w:val="17"/>
-              </w:rPr>
+              <w:t>BAND-IT (catalogue: ACDC Dynamics, page 20.66 P3)</w:t>
             </w:r>
           </w:p>
         </w:tc>
@@ -2510,7 +2495,7 @@
                 <w:i w:val="0"/>
                 <w:sz w:val="17"/>
               </w:rPr>
-              <w:t>Manufacturer letter / datasheet</w:t>
+              <w:t>Catalogue page 20.66 P3 + OEM datasheet</w:t>
             </w:r>
           </w:p>
         </w:tc>
@@ -2577,7 +2562,7 @@
                 <w:sz w:val="17"/>
                 <w:highlight w:val="yellow"/>
               </w:rPr>
-              <w:t>[ENTER - imported; country not supplied]</w:t>
+              <w:t>[CONFIRM with supplier - imported; not stated on catalogue page]</w:t>
             </w:r>
             <w:r>
               <w:rPr>
@@ -2837,7 +2822,7 @@
                 <w:i w:val="0"/>
                 <w:sz w:val="17"/>
               </w:rPr>
-              <w:t>Drawing / datasheet</w:t>
+              <w:t>Catalogue page / datasheet</w:t>
             </w:r>
           </w:p>
         </w:tc>
@@ -3177,23 +3162,7 @@
                 <w:i w:val="0"/>
                 <w:sz w:val="17"/>
               </w:rPr>
-              <w:t xml:space="preserve">Bandit tool with buckle </w:t>
-            </w:r>
-            <w:r>
-              <w:rPr>
-                <w:b w:val="0"/>
-                <w:i w:val="0"/>
-                <w:sz w:val="17"/>
-                <w:highlight w:val="yellow"/>
-              </w:rPr>
-              <w:t>[confirm compatible buckle]</w:t>
-            </w:r>
-            <w:r>
-              <w:rPr>
-                <w:b w:val="0"/>
-                <w:i w:val="0"/>
-                <w:sz w:val="17"/>
-              </w:rPr>
+              <w:t>Band-It tool fastening with SS304 buckle RCU12FJ (12.7 mm, 100/box); tools RR-R06 / RR-T03 / RR-B04</w:t>
             </w:r>
           </w:p>
         </w:tc>
@@ -3271,7 +3240,7 @@
                 <w:i w:val="0"/>
                 <w:sz w:val="17"/>
               </w:rPr>
-              <w:t xml:space="preserve">Manufacturer's trademark and part no. stamped on strap </w:t>
+              <w:t xml:space="preserve">Manufacturer's trademark and part no. RSU12F304 on strap </w:t>
             </w:r>
             <w:r>
               <w:rPr>
@@ -3280,7 +3249,7 @@
                 <w:sz w:val="17"/>
                 <w:highlight w:val="yellow"/>
               </w:rPr>
-              <w:t>[describe mark]</w:t>
+              <w:t>[confirm stamped, not painted - check sample]</w:t>
             </w:r>
             <w:r>
               <w:rPr>

</xml_diff>